<commit_message>
read JSON file, main loop and spike report complete.
</commit_message>
<xml_diff>
--- a/11 - Spike - Game Graphs from Data/Task 11 - Lab Spike Report.docx
+++ b/11 - Spike - Game Graphs from Data/Task 11 - Lab Spike Report.docx
@@ -11,6 +11,8 @@
           <w:sz w:val="28"/>
         </w:rPr>
       </w:pPr>
+      <w:bookmarkStart w:id="0" w:name="_Hlk148534165"/>
+      <w:bookmarkEnd w:id="0"/>
       <w:r>
         <w:rPr>
           <w:b/>
@@ -148,25 +150,7 @@
           <w:sz w:val="24"/>
           <w:szCs w:val="24"/>
         </w:rPr>
-        <w:t xml:space="preserve">understanding of data </w:t>
-      </w:r>
-      <w:proofErr w:type="gramStart"/>
-      <w:r>
-        <w:rPr>
-          <w:rStyle w:val="SubtleReference"/>
-          <w:sz w:val="24"/>
-          <w:szCs w:val="24"/>
-        </w:rPr>
-        <w:t>structures ,reading</w:t>
-      </w:r>
-      <w:proofErr w:type="gramEnd"/>
-      <w:r>
-        <w:rPr>
-          <w:rStyle w:val="SubtleReference"/>
-          <w:sz w:val="24"/>
-          <w:szCs w:val="24"/>
-        </w:rPr>
-        <w:t xml:space="preserve"> and outputting from files that I have learnt from previous tasks in order to create a game world as a graph data structure.</w:t>
+        <w:t>understanding of data structures ,reading and outputting from files that I have learnt from previous tasks in order to create a game world as a graph data structure.</w:t>
       </w:r>
     </w:p>
     <w:p>
@@ -659,31 +643,85 @@
           <w:sz w:val="24"/>
           <w:szCs w:val="24"/>
         </w:rPr>
-        <w:t>Creating Inventory</w:t>
-      </w:r>
-      <w:r>
-        <w:rPr>
-          <w:rStyle w:val="SubtleReference"/>
-          <w:sz w:val="24"/>
-          <w:szCs w:val="24"/>
-        </w:rPr>
-        <w:t xml:space="preserve"> and</w:t>
-      </w:r>
-      <w:r>
-        <w:rPr>
-          <w:rStyle w:val="SubtleReference"/>
-          <w:sz w:val="24"/>
-          <w:szCs w:val="24"/>
-        </w:rPr>
-        <w:t xml:space="preserve"> Item </w:t>
-      </w:r>
-      <w:r>
-        <w:rPr>
-          <w:rStyle w:val="SubtleReference"/>
-          <w:sz w:val="24"/>
-          <w:szCs w:val="24"/>
-        </w:rPr>
-        <w:t>Class</w:t>
+        <w:t xml:space="preserve">Importing </w:t>
+      </w:r>
+      <w:proofErr w:type="spellStart"/>
+      <w:r>
+        <w:rPr>
+          <w:b/>
+          <w:bCs/>
+          <w:color w:val="5A5A5A" w:themeColor="text1" w:themeTint="A5"/>
+          <w:sz w:val="24"/>
+        </w:rPr>
+        <w:t>nlohmann</w:t>
+      </w:r>
+      <w:proofErr w:type="spellEnd"/>
+      <w:r>
+        <w:rPr>
+          <w:b/>
+          <w:bCs/>
+          <w:color w:val="5A5A5A" w:themeColor="text1" w:themeTint="A5"/>
+          <w:sz w:val="24"/>
+        </w:rPr>
+        <w:t>::</w:t>
+      </w:r>
+      <w:proofErr w:type="spellStart"/>
+      <w:r>
+        <w:rPr>
+          <w:b/>
+          <w:bCs/>
+          <w:color w:val="5A5A5A" w:themeColor="text1" w:themeTint="A5"/>
+          <w:sz w:val="24"/>
+        </w:rPr>
+        <w:t>json</w:t>
+      </w:r>
+      <w:proofErr w:type="spellEnd"/>
+      <w:r>
+        <w:rPr>
+          <w:b/>
+          <w:bCs/>
+          <w:color w:val="5A5A5A" w:themeColor="text1" w:themeTint="A5"/>
+          <w:sz w:val="24"/>
+        </w:rPr>
+        <w:t xml:space="preserve"> </w:t>
+      </w:r>
+      <w:r>
+        <w:rPr>
+          <w:color w:val="5A5A5A" w:themeColor="text1" w:themeTint="A5"/>
+          <w:sz w:val="24"/>
+        </w:rPr>
+        <w:t>library.</w:t>
+      </w:r>
+    </w:p>
+    <w:p>
+      <w:pPr>
+        <w:pStyle w:val="ColorfulList-Accent11"/>
+        <w:numPr>
+          <w:ilvl w:val="0"/>
+          <w:numId w:val="1"/>
+        </w:numPr>
+        <w:spacing w:line="360" w:lineRule="auto"/>
+        <w:rPr>
+          <w:rStyle w:val="SubtleReference"/>
+          <w:sz w:val="24"/>
+          <w:szCs w:val="24"/>
+        </w:rPr>
+      </w:pPr>
+      <w:r>
+        <w:rPr>
+          <w:rStyle w:val="SubtleReference"/>
+          <w:sz w:val="24"/>
+          <w:szCs w:val="24"/>
+        </w:rPr>
+        <w:t xml:space="preserve">Creating </w:t>
+      </w:r>
+      <w:r>
+        <w:rPr>
+          <w:rStyle w:val="SubtleReference"/>
+          <w:sz w:val="24"/>
+          <w:szCs w:val="24"/>
+        </w:rPr>
+        <w:t>Location</w:t>
       </w:r>
     </w:p>
     <w:p>
@@ -700,47 +738,6 @@
     </w:p>
     <w:p>
       <w:pPr>
-        <w:pStyle w:val="ColorfulList-Accent11"/>
-        <w:spacing w:line="360" w:lineRule="auto"/>
-        <w:ind w:left="0"/>
-        <w:rPr>
-          <w:color w:val="5A5A5A" w:themeColor="text1" w:themeTint="A5"/>
-          <w:sz w:val="28"/>
-          <w:szCs w:val="28"/>
-        </w:rPr>
-      </w:pPr>
-    </w:p>
-    <w:p>
-      <w:pPr>
-        <w:pStyle w:val="ColorfulList-Accent11"/>
-        <w:spacing w:line="360" w:lineRule="auto"/>
-        <w:ind w:left="0"/>
-        <w:rPr>
-          <w:color w:val="5A5A5A" w:themeColor="text1" w:themeTint="A5"/>
-          <w:sz w:val="28"/>
-          <w:szCs w:val="28"/>
-        </w:rPr>
-      </w:pPr>
-    </w:p>
-    <w:p>
-      <w:pPr>
-        <w:spacing w:line="360" w:lineRule="auto"/>
-        <w:rPr>
-          <w:b/>
-          <w:sz w:val="24"/>
-        </w:rPr>
-      </w:pPr>
-      <w:r>
-        <w:rPr>
-          <w:b/>
-          <w:sz w:val="24"/>
-        </w:rPr>
-        <w:lastRenderedPageBreak/>
-        <w:t>What we found out:</w:t>
-      </w:r>
-    </w:p>
-    <w:p>
-      <w:pPr>
         <w:spacing w:line="360" w:lineRule="auto"/>
         <w:rPr>
           <w:b/>
@@ -766,6 +763,7 @@
           <w:sz w:val="28"/>
           <w:szCs w:val="28"/>
         </w:rPr>
+        <w:lastRenderedPageBreak/>
         <w:t xml:space="preserve">File Format Design </w:t>
       </w:r>
     </w:p>
@@ -980,29 +978,13 @@
           <w:sz w:val="24"/>
           <w:szCs w:val="32"/>
         </w:rPr>
-        <w:t xml:space="preserve">We created a .JSON file where the root object is locations which will basically contain locations in </w:t>
-      </w:r>
-      <w:proofErr w:type="gramStart"/>
+        <w:t>We created a .JSON file where the root object is locations which will basically contain locations in an carry and each location object holds name, description and connections for each location</w:t>
+      </w:r>
       <w:r>
         <w:rPr>
           <w:sz w:val="24"/>
           <w:szCs w:val="32"/>
         </w:rPr>
-        <w:t>an</w:t>
-      </w:r>
-      <w:proofErr w:type="gramEnd"/>
-      <w:r>
-        <w:rPr>
-          <w:sz w:val="24"/>
-          <w:szCs w:val="32"/>
-        </w:rPr>
-        <w:t xml:space="preserve"> carry and each location object holds name, description and connections for each location</w:t>
-      </w:r>
-      <w:r>
-        <w:rPr>
-          <w:sz w:val="24"/>
-          <w:szCs w:val="32"/>
-        </w:rPr>
         <w:t>.</w:t>
       </w:r>
     </w:p>
@@ -1040,10 +1022,963 @@
       <w:pPr>
         <w:spacing w:line="360" w:lineRule="auto"/>
         <w:jc w:val="both"/>
+        <w:rPr>
+          <w:b/>
+          <w:color w:val="767171" w:themeColor="background2" w:themeShade="80"/>
+          <w:sz w:val="28"/>
+          <w:szCs w:val="28"/>
+        </w:rPr>
+      </w:pPr>
+      <w:r>
+        <w:rPr>
+          <w:b/>
+          <w:color w:val="767171" w:themeColor="background2" w:themeShade="80"/>
+          <w:sz w:val="28"/>
+          <w:szCs w:val="28"/>
+        </w:rPr>
+        <w:t>Implement the Classes</w:t>
+      </w:r>
+    </w:p>
+    <w:p>
+      <w:pPr>
+        <w:spacing w:line="360" w:lineRule="auto"/>
+        <w:jc w:val="both"/>
+        <w:rPr>
+          <w:b/>
+          <w:color w:val="767171" w:themeColor="background2" w:themeShade="80"/>
+          <w:sz w:val="28"/>
+          <w:szCs w:val="28"/>
+        </w:rPr>
+      </w:pPr>
+    </w:p>
+    <w:p>
+      <w:pPr>
+        <w:pStyle w:val="ListParagraph"/>
+        <w:numPr>
+          <w:ilvl w:val="0"/>
+          <w:numId w:val="7"/>
+        </w:numPr>
+        <w:spacing w:line="360" w:lineRule="auto"/>
+        <w:jc w:val="both"/>
+        <w:rPr>
+          <w:b/>
+          <w:bCs/>
+          <w:sz w:val="28"/>
+          <w:szCs w:val="36"/>
+        </w:rPr>
+      </w:pPr>
+      <w:r>
+        <w:rPr>
+          <w:b/>
+          <w:bCs/>
+          <w:sz w:val="28"/>
+          <w:szCs w:val="36"/>
+        </w:rPr>
+        <w:t>Implement Location Class</w:t>
+      </w:r>
+      <w:r>
+        <w:rPr>
+          <w:b/>
+          <w:bCs/>
+          <w:sz w:val="28"/>
+          <w:szCs w:val="36"/>
+        </w:rPr>
+        <w:t>:</w:t>
+      </w:r>
+    </w:p>
+    <w:p>
+      <w:pPr>
+        <w:pStyle w:val="ListParagraph"/>
+        <w:spacing w:line="360" w:lineRule="auto"/>
+        <w:jc w:val="both"/>
+        <w:rPr>
+          <w:b/>
+          <w:bCs/>
+          <w:noProof/>
+          <w:sz w:val="28"/>
+          <w:szCs w:val="36"/>
+        </w:rPr>
+      </w:pPr>
+    </w:p>
+    <w:p>
+      <w:pPr>
+        <w:pStyle w:val="ListParagraph"/>
+        <w:spacing w:line="360" w:lineRule="auto"/>
+        <w:jc w:val="both"/>
+        <w:rPr>
+          <w:b/>
+          <w:bCs/>
+          <w:noProof/>
+          <w:sz w:val="28"/>
+          <w:szCs w:val="36"/>
+        </w:rPr>
+      </w:pPr>
+      <w:r>
+        <w:rPr>
+          <w:b/>
+          <w:bCs/>
+          <w:noProof/>
+          <w:sz w:val="28"/>
+          <w:szCs w:val="36"/>
+        </w:rPr>
+        <w:drawing>
+          <wp:inline distT="0" distB="0" distL="0" distR="0" wp14:anchorId="038F7D0D" wp14:editId="616583F3">
+            <wp:extent cx="5223753" cy="2508885"/>
+            <wp:effectExtent l="0" t="0" r="0" b="5715"/>
+            <wp:docPr id="919107934" name="Picture 2" descr="A screen shot of a computer program&#10;&#10;Description automatically generated"/>
+            <wp:cNvGraphicFramePr>
+              <a:graphicFrameLocks xmlns:a="http://schemas.openxmlformats.org/drawingml/2006/main" noChangeAspect="1"/>
+            </wp:cNvGraphicFramePr>
+            <a:graphic xmlns:a="http://schemas.openxmlformats.org/drawingml/2006/main">
+              <a:graphicData uri="http://schemas.openxmlformats.org/drawingml/2006/picture">
+                <pic:pic xmlns:pic="http://schemas.openxmlformats.org/drawingml/2006/picture">
+                  <pic:nvPicPr>
+                    <pic:cNvPr id="919107934" name="Picture 2" descr="A screen shot of a computer program&#10;&#10;Description automatically generated"/>
+                    <pic:cNvPicPr>
+                      <a:picLocks noChangeAspect="1" noChangeArrowheads="1"/>
+                    </pic:cNvPicPr>
+                  </pic:nvPicPr>
+                  <pic:blipFill rotWithShape="1">
+                    <a:blip r:embed="rId9">
+                      <a:extLst>
+                        <a:ext uri="{28A0092B-C50C-407E-A947-70E740481C1C}">
+                          <a14:useLocalDpi xmlns:a14="http://schemas.microsoft.com/office/drawing/2010/main" val="0"/>
+                        </a:ext>
+                      </a:extLst>
+                    </a:blip>
+                    <a:srcRect l="7327" t="11834" r="7132" b="11837"/>
+                    <a:stretch/>
+                  </pic:blipFill>
+                  <pic:spPr bwMode="auto">
+                    <a:xfrm>
+                      <a:off x="0" y="0"/>
+                      <a:ext cx="5225506" cy="2509727"/>
+                    </a:xfrm>
+                    <a:prstGeom prst="rect">
+                      <a:avLst/>
+                    </a:prstGeom>
+                    <a:noFill/>
+                    <a:ln>
+                      <a:noFill/>
+                    </a:ln>
+                    <a:extLst>
+                      <a:ext uri="{53640926-AAD7-44D8-BBD7-CCE9431645EC}">
+                        <a14:shadowObscured xmlns:a14="http://schemas.microsoft.com/office/drawing/2010/main"/>
+                      </a:ext>
+                    </a:extLst>
+                  </pic:spPr>
+                </pic:pic>
+              </a:graphicData>
+            </a:graphic>
+          </wp:inline>
+        </w:drawing>
+      </w:r>
+    </w:p>
+    <w:p>
+      <w:pPr>
+        <w:pStyle w:val="ListParagraph"/>
+        <w:spacing w:line="360" w:lineRule="auto"/>
+        <w:jc w:val="both"/>
+        <w:rPr>
+          <w:b/>
+          <w:bCs/>
+          <w:sz w:val="28"/>
+          <w:szCs w:val="36"/>
+        </w:rPr>
+      </w:pPr>
+      <w:r>
+        <w:rPr>
+          <w:b/>
+          <w:bCs/>
+          <w:noProof/>
+          <w:sz w:val="28"/>
+          <w:szCs w:val="36"/>
+        </w:rPr>
+        <w:drawing>
+          <wp:inline distT="0" distB="0" distL="0" distR="0" wp14:anchorId="38E4697C" wp14:editId="1A578F13">
+            <wp:extent cx="5272391" cy="1147405"/>
+            <wp:effectExtent l="0" t="0" r="5080" b="0"/>
+            <wp:docPr id="441089459" name="Picture 3"/>
+            <wp:cNvGraphicFramePr>
+              <a:graphicFrameLocks xmlns:a="http://schemas.openxmlformats.org/drawingml/2006/main" noChangeAspect="1"/>
+            </wp:cNvGraphicFramePr>
+            <a:graphic xmlns:a="http://schemas.openxmlformats.org/drawingml/2006/main">
+              <a:graphicData uri="http://schemas.openxmlformats.org/drawingml/2006/picture">
+                <pic:pic xmlns:pic="http://schemas.openxmlformats.org/drawingml/2006/picture">
+                  <pic:nvPicPr>
+                    <pic:cNvPr id="0" name="Picture 3"/>
+                    <pic:cNvPicPr>
+                      <a:picLocks noChangeAspect="1" noChangeArrowheads="1"/>
+                    </pic:cNvPicPr>
+                  </pic:nvPicPr>
+                  <pic:blipFill rotWithShape="1">
+                    <a:blip r:embed="rId10">
+                      <a:extLst>
+                        <a:ext uri="{28A0092B-C50C-407E-A947-70E740481C1C}">
+                          <a14:useLocalDpi xmlns:a14="http://schemas.microsoft.com/office/drawing/2010/main" val="0"/>
+                        </a:ext>
+                      </a:extLst>
+                    </a:blip>
+                    <a:srcRect l="6692" t="19273" r="6958" b="19258"/>
+                    <a:stretch/>
+                  </pic:blipFill>
+                  <pic:spPr bwMode="auto">
+                    <a:xfrm>
+                      <a:off x="0" y="0"/>
+                      <a:ext cx="5274923" cy="1147956"/>
+                    </a:xfrm>
+                    <a:prstGeom prst="rect">
+                      <a:avLst/>
+                    </a:prstGeom>
+                    <a:noFill/>
+                    <a:ln>
+                      <a:noFill/>
+                    </a:ln>
+                    <a:extLst>
+                      <a:ext uri="{53640926-AAD7-44D8-BBD7-CCE9431645EC}">
+                        <a14:shadowObscured xmlns:a14="http://schemas.microsoft.com/office/drawing/2010/main"/>
+                      </a:ext>
+                    </a:extLst>
+                  </pic:spPr>
+                </pic:pic>
+              </a:graphicData>
+            </a:graphic>
+          </wp:inline>
+        </w:drawing>
+      </w:r>
+    </w:p>
+    <w:p>
+      <w:pPr>
+        <w:spacing w:line="360" w:lineRule="auto"/>
+        <w:jc w:val="both"/>
+        <w:rPr>
+          <w:color w:val="000000" w:themeColor="text1"/>
+          <w:sz w:val="24"/>
+          <w:lang w:val="en-US" w:eastAsia="en-US"/>
+        </w:rPr>
+      </w:pPr>
+      <w:r>
+        <w:rPr>
+          <w:color w:val="000000" w:themeColor="text1"/>
+          <w:sz w:val="24"/>
+          <w:lang w:val="en-US" w:eastAsia="en-US"/>
+        </w:rPr>
+        <w:t xml:space="preserve">The </w:t>
+      </w:r>
+      <w:proofErr w:type="spellStart"/>
+      <w:r>
+        <w:rPr>
+          <w:b/>
+          <w:bCs/>
+          <w:color w:val="000000" w:themeColor="text1"/>
+          <w:sz w:val="24"/>
+          <w:lang w:val="en-US" w:eastAsia="en-US"/>
+        </w:rPr>
+        <w:t>Location</w:t>
+      </w:r>
+      <w:r>
+        <w:rPr>
+          <w:b/>
+          <w:bCs/>
+          <w:color w:val="000000" w:themeColor="text1"/>
+          <w:sz w:val="24"/>
+          <w:lang w:val="en-US" w:eastAsia="en-US"/>
+        </w:rPr>
+        <w:t>.h</w:t>
+      </w:r>
+      <w:proofErr w:type="spellEnd"/>
+      <w:r>
+        <w:rPr>
+          <w:color w:val="000000" w:themeColor="text1"/>
+          <w:sz w:val="24"/>
+          <w:lang w:val="en-US" w:eastAsia="en-US"/>
+        </w:rPr>
+        <w:t xml:space="preserve"> file defines </w:t>
+      </w:r>
+      <w:r>
+        <w:rPr>
+          <w:color w:val="000000" w:themeColor="text1"/>
+          <w:sz w:val="24"/>
+          <w:lang w:val="en-US" w:eastAsia="en-US"/>
+        </w:rPr>
+        <w:t>the</w:t>
+      </w:r>
+      <w:r>
+        <w:rPr>
+          <w:color w:val="000000" w:themeColor="text1"/>
+          <w:sz w:val="24"/>
+          <w:lang w:val="en-US" w:eastAsia="en-US"/>
+        </w:rPr>
+        <w:t xml:space="preserve"> class named </w:t>
+      </w:r>
+      <w:r>
+        <w:rPr>
+          <w:b/>
+          <w:bCs/>
+          <w:color w:val="000000" w:themeColor="text1"/>
+          <w:sz w:val="24"/>
+          <w:lang w:val="en-US" w:eastAsia="en-US"/>
+        </w:rPr>
+        <w:t>Location</w:t>
+      </w:r>
+      <w:r>
+        <w:rPr>
+          <w:color w:val="000000" w:themeColor="text1"/>
+          <w:sz w:val="24"/>
+          <w:lang w:val="en-US" w:eastAsia="en-US"/>
+        </w:rPr>
+        <w:t xml:space="preserve"> where it</w:t>
+      </w:r>
+      <w:r>
+        <w:rPr>
+          <w:color w:val="000000" w:themeColor="text1"/>
+          <w:sz w:val="24"/>
+          <w:lang w:val="en-US" w:eastAsia="en-US"/>
+        </w:rPr>
+        <w:t xml:space="preserve"> represents a specific place within the game world</w:t>
+      </w:r>
+      <w:r>
+        <w:rPr>
+          <w:color w:val="000000" w:themeColor="text1"/>
+          <w:sz w:val="24"/>
+          <w:lang w:val="en-US" w:eastAsia="en-US"/>
+        </w:rPr>
+        <w:t xml:space="preserve"> and has a constructor that allows initialization of </w:t>
+      </w:r>
+      <w:r>
+        <w:rPr>
+          <w:b/>
+          <w:bCs/>
+          <w:color w:val="000000" w:themeColor="text1"/>
+          <w:sz w:val="24"/>
+          <w:lang w:val="en-US" w:eastAsia="en-US"/>
+        </w:rPr>
+        <w:t>Location</w:t>
+      </w:r>
+      <w:r>
+        <w:rPr>
+          <w:color w:val="000000" w:themeColor="text1"/>
+          <w:sz w:val="24"/>
+          <w:lang w:val="en-US" w:eastAsia="en-US"/>
+        </w:rPr>
+        <w:t xml:space="preserve"> object using its name and description</w:t>
+      </w:r>
+      <w:r>
+        <w:rPr>
+          <w:color w:val="000000" w:themeColor="text1"/>
+          <w:sz w:val="24"/>
+          <w:lang w:val="en-US" w:eastAsia="en-US"/>
+        </w:rPr>
+        <w:t>. It contains three public member variables:</w:t>
+      </w:r>
+    </w:p>
+    <w:p>
+      <w:pPr>
+        <w:spacing w:line="360" w:lineRule="auto"/>
+        <w:jc w:val="both"/>
+        <w:rPr>
+          <w:color w:val="000000" w:themeColor="text1"/>
+          <w:sz w:val="24"/>
+          <w:lang w:val="en-US" w:eastAsia="en-US"/>
+        </w:rPr>
+      </w:pPr>
+    </w:p>
+    <w:p>
+      <w:pPr>
+        <w:pStyle w:val="ListParagraph"/>
+        <w:numPr>
+          <w:ilvl w:val="0"/>
+          <w:numId w:val="9"/>
+        </w:numPr>
+        <w:spacing w:line="360" w:lineRule="auto"/>
+        <w:jc w:val="both"/>
+        <w:rPr>
+          <w:color w:val="000000" w:themeColor="text1"/>
+          <w:sz w:val="24"/>
+          <w:lang w:val="en-US" w:eastAsia="en-US"/>
+        </w:rPr>
+      </w:pPr>
+      <w:r>
+        <w:rPr>
+          <w:b/>
+          <w:bCs/>
+          <w:color w:val="000000" w:themeColor="text1"/>
+          <w:sz w:val="24"/>
+          <w:lang w:val="en-US" w:eastAsia="en-US"/>
+        </w:rPr>
+        <w:t>name</w:t>
+      </w:r>
+      <w:r>
+        <w:rPr>
+          <w:color w:val="000000" w:themeColor="text1"/>
+          <w:sz w:val="24"/>
+          <w:lang w:val="en-US" w:eastAsia="en-US"/>
+        </w:rPr>
+        <w:t xml:space="preserve"> </w:t>
+      </w:r>
+      <w:r>
+        <w:rPr>
+          <w:color w:val="000000" w:themeColor="text1"/>
+          <w:sz w:val="24"/>
+          <w:lang w:val="en-US" w:eastAsia="en-US"/>
+        </w:rPr>
+        <w:t>– Represents the name of the location (e.g., "forest" or "cave").</w:t>
+      </w:r>
+    </w:p>
+    <w:p>
+      <w:pPr>
+        <w:pStyle w:val="ListParagraph"/>
+        <w:numPr>
+          <w:ilvl w:val="0"/>
+          <w:numId w:val="9"/>
+        </w:numPr>
+        <w:spacing w:line="360" w:lineRule="auto"/>
+        <w:jc w:val="both"/>
+        <w:rPr>
+          <w:color w:val="000000" w:themeColor="text1"/>
+          <w:sz w:val="24"/>
+          <w:lang w:val="en-US" w:eastAsia="en-US"/>
+        </w:rPr>
+      </w:pPr>
+      <w:r>
+        <w:rPr>
+          <w:b/>
+          <w:bCs/>
+          <w:color w:val="000000" w:themeColor="text1"/>
+          <w:sz w:val="24"/>
+          <w:lang w:val="en-US" w:eastAsia="en-US"/>
+        </w:rPr>
+        <w:t>description</w:t>
+      </w:r>
+      <w:r>
+        <w:rPr>
+          <w:color w:val="000000" w:themeColor="text1"/>
+          <w:sz w:val="24"/>
+          <w:lang w:val="en-US" w:eastAsia="en-US"/>
+        </w:rPr>
+        <w:t xml:space="preserve"> </w:t>
+      </w:r>
+      <w:r>
+        <w:rPr>
+          <w:color w:val="000000" w:themeColor="text1"/>
+          <w:sz w:val="24"/>
+          <w:lang w:val="en-US" w:eastAsia="en-US"/>
+        </w:rPr>
+        <w:t>– Provides a textual description of the location to give context to the player (e.g., "A dense, green forest with birds chirping.").</w:t>
+      </w:r>
+    </w:p>
+    <w:p>
+      <w:pPr>
+        <w:pStyle w:val="ListParagraph"/>
+        <w:numPr>
+          <w:ilvl w:val="0"/>
+          <w:numId w:val="9"/>
+        </w:numPr>
+        <w:spacing w:line="360" w:lineRule="auto"/>
+        <w:jc w:val="both"/>
+        <w:rPr>
+          <w:color w:val="000000" w:themeColor="text1"/>
+          <w:sz w:val="24"/>
+          <w:lang w:val="en-US" w:eastAsia="en-US"/>
+        </w:rPr>
+      </w:pPr>
+      <w:r>
+        <w:rPr>
+          <w:b/>
+          <w:bCs/>
+          <w:color w:val="000000" w:themeColor="text1"/>
+          <w:sz w:val="24"/>
+          <w:lang w:val="en-US" w:eastAsia="en-US"/>
+        </w:rPr>
+        <w:t>c</w:t>
+      </w:r>
+      <w:r>
+        <w:rPr>
+          <w:b/>
+          <w:bCs/>
+          <w:color w:val="000000" w:themeColor="text1"/>
+          <w:sz w:val="24"/>
+          <w:lang w:val="en-US" w:eastAsia="en-US"/>
+        </w:rPr>
+        <w:t>onnections</w:t>
+      </w:r>
+      <w:r>
+        <w:rPr>
+          <w:color w:val="000000" w:themeColor="text1"/>
+          <w:sz w:val="24"/>
+          <w:lang w:val="en-US" w:eastAsia="en-US"/>
+        </w:rPr>
+        <w:t xml:space="preserve"> </w:t>
+      </w:r>
+      <w:r>
+        <w:rPr>
+          <w:color w:val="000000" w:themeColor="text1"/>
+          <w:sz w:val="24"/>
+          <w:lang w:val="en-US" w:eastAsia="en-US"/>
+        </w:rPr>
+        <w:t>– A map (specifically a</w:t>
+      </w:r>
+      <w:r>
+        <w:rPr>
+          <w:color w:val="000000" w:themeColor="text1"/>
+          <w:sz w:val="24"/>
+          <w:lang w:val="en-US" w:eastAsia="en-US"/>
+        </w:rPr>
+        <w:t xml:space="preserve">n </w:t>
+      </w:r>
+      <w:proofErr w:type="spellStart"/>
+      <w:r>
+        <w:rPr>
+          <w:b/>
+          <w:bCs/>
+          <w:color w:val="000000" w:themeColor="text1"/>
+          <w:sz w:val="24"/>
+          <w:lang w:val="en-US" w:eastAsia="en-US"/>
+        </w:rPr>
+        <w:t>unordered_map</w:t>
+      </w:r>
+      <w:proofErr w:type="spellEnd"/>
+      <w:r>
+        <w:rPr>
+          <w:color w:val="000000" w:themeColor="text1"/>
+          <w:sz w:val="24"/>
+          <w:lang w:val="en-US" w:eastAsia="en-US"/>
+        </w:rPr>
+        <w:t xml:space="preserve">) that associates directions (e.g., "north", "south") with pointers to other </w:t>
+      </w:r>
+      <w:r>
+        <w:rPr>
+          <w:b/>
+          <w:bCs/>
+          <w:color w:val="000000" w:themeColor="text1"/>
+          <w:sz w:val="24"/>
+          <w:lang w:val="en-US" w:eastAsia="en-US"/>
+        </w:rPr>
+        <w:t>Location</w:t>
+      </w:r>
+      <w:r>
+        <w:rPr>
+          <w:color w:val="000000" w:themeColor="text1"/>
+          <w:sz w:val="24"/>
+          <w:lang w:val="en-US" w:eastAsia="en-US"/>
+        </w:rPr>
+        <w:t xml:space="preserve"> objects, indicating where the player can travel from the current location.</w:t>
+      </w:r>
+    </w:p>
+    <w:p>
+      <w:pPr>
+        <w:spacing w:line="360" w:lineRule="auto"/>
+        <w:jc w:val="both"/>
+        <w:rPr>
+          <w:color w:val="000000" w:themeColor="text1"/>
+          <w:sz w:val="24"/>
+          <w:lang w:val="en-US" w:eastAsia="en-US"/>
+        </w:rPr>
+      </w:pPr>
+    </w:p>
+    <w:p>
+      <w:pPr>
+        <w:spacing w:line="360" w:lineRule="auto"/>
+        <w:jc w:val="both"/>
+        <w:rPr>
+          <w:color w:val="000000" w:themeColor="text1"/>
+          <w:sz w:val="24"/>
+          <w:lang w:eastAsia="en-US"/>
+        </w:rPr>
+      </w:pPr>
+      <w:r>
+        <w:rPr>
+          <w:color w:val="000000" w:themeColor="text1"/>
+          <w:sz w:val="24"/>
+          <w:lang w:eastAsia="en-US"/>
+        </w:rPr>
+        <w:t xml:space="preserve">The </w:t>
+      </w:r>
+      <w:r>
+        <w:rPr>
+          <w:b/>
+          <w:bCs/>
+          <w:color w:val="000000" w:themeColor="text1"/>
+          <w:sz w:val="24"/>
+          <w:lang w:eastAsia="en-US"/>
+        </w:rPr>
+        <w:t>Location.cpp</w:t>
+      </w:r>
+      <w:r>
+        <w:rPr>
+          <w:color w:val="000000" w:themeColor="text1"/>
+          <w:sz w:val="24"/>
+          <w:lang w:eastAsia="en-US"/>
+        </w:rPr>
+        <w:t xml:space="preserve"> file provides </w:t>
+      </w:r>
+      <w:r>
+        <w:rPr>
+          <w:color w:val="000000" w:themeColor="text1"/>
+          <w:sz w:val="24"/>
+          <w:lang w:eastAsia="en-US"/>
+        </w:rPr>
+        <w:t>a</w:t>
+      </w:r>
+      <w:r>
+        <w:rPr>
+          <w:color w:val="000000" w:themeColor="text1"/>
+          <w:sz w:val="24"/>
+          <w:lang w:eastAsia="en-US"/>
+        </w:rPr>
+        <w:t xml:space="preserve"> implementation for the </w:t>
+      </w:r>
+      <w:r>
+        <w:rPr>
+          <w:b/>
+          <w:bCs/>
+          <w:color w:val="000000" w:themeColor="text1"/>
+          <w:sz w:val="24"/>
+          <w:lang w:eastAsia="en-US"/>
+        </w:rPr>
+        <w:t>Location</w:t>
+      </w:r>
+      <w:r>
+        <w:rPr>
+          <w:color w:val="000000" w:themeColor="text1"/>
+          <w:sz w:val="24"/>
+          <w:lang w:eastAsia="en-US"/>
+        </w:rPr>
+        <w:t xml:space="preserve"> class. Specifically, it contains the definition for the constructor </w:t>
+      </w:r>
+      <w:r>
+        <w:rPr>
+          <w:color w:val="000000" w:themeColor="text1"/>
+          <w:sz w:val="24"/>
+          <w:lang w:eastAsia="en-US"/>
+        </w:rPr>
+        <w:t>used in</w:t>
+      </w:r>
+      <w:r>
+        <w:rPr>
+          <w:color w:val="000000" w:themeColor="text1"/>
+          <w:sz w:val="24"/>
+          <w:lang w:eastAsia="en-US"/>
+        </w:rPr>
+        <w:t xml:space="preserve"> </w:t>
+      </w:r>
+      <w:r>
+        <w:rPr>
+          <w:b/>
+          <w:bCs/>
+          <w:color w:val="000000" w:themeColor="text1"/>
+          <w:sz w:val="24"/>
+          <w:lang w:eastAsia="en-US"/>
+        </w:rPr>
+        <w:t>Location</w:t>
+      </w:r>
+      <w:r>
+        <w:rPr>
+          <w:color w:val="000000" w:themeColor="text1"/>
+          <w:sz w:val="24"/>
+          <w:lang w:eastAsia="en-US"/>
+        </w:rPr>
+        <w:t xml:space="preserve"> class</w:t>
+      </w:r>
+      <w:r>
+        <w:rPr>
+          <w:color w:val="000000" w:themeColor="text1"/>
+          <w:sz w:val="24"/>
+          <w:lang w:eastAsia="en-US"/>
+        </w:rPr>
+        <w:t xml:space="preserve"> to</w:t>
+      </w:r>
+      <w:r>
+        <w:rPr>
+          <w:color w:val="000000" w:themeColor="text1"/>
+          <w:sz w:val="24"/>
+          <w:lang w:eastAsia="en-US"/>
+        </w:rPr>
+        <w:t xml:space="preserve"> initializes the </w:t>
+      </w:r>
+      <w:r>
+        <w:rPr>
+          <w:b/>
+          <w:bCs/>
+          <w:color w:val="000000" w:themeColor="text1"/>
+          <w:sz w:val="24"/>
+          <w:lang w:eastAsia="en-US"/>
+        </w:rPr>
+        <w:t>name</w:t>
+      </w:r>
+      <w:r>
+        <w:rPr>
+          <w:color w:val="000000" w:themeColor="text1"/>
+          <w:sz w:val="24"/>
+          <w:lang w:eastAsia="en-US"/>
+        </w:rPr>
+        <w:t xml:space="preserve"> and </w:t>
+      </w:r>
+      <w:r>
+        <w:rPr>
+          <w:b/>
+          <w:bCs/>
+          <w:color w:val="000000" w:themeColor="text1"/>
+          <w:sz w:val="24"/>
+          <w:lang w:eastAsia="en-US"/>
+        </w:rPr>
+        <w:t>description</w:t>
+      </w:r>
+      <w:r>
+        <w:rPr>
+          <w:color w:val="000000" w:themeColor="text1"/>
+          <w:sz w:val="24"/>
+          <w:lang w:eastAsia="en-US"/>
+        </w:rPr>
+        <w:t xml:space="preserve"> of the </w:t>
+      </w:r>
+      <w:r>
+        <w:rPr>
+          <w:b/>
+          <w:bCs/>
+          <w:color w:val="000000" w:themeColor="text1"/>
+          <w:sz w:val="24"/>
+          <w:lang w:eastAsia="en-US"/>
+        </w:rPr>
+        <w:t>Location</w:t>
+      </w:r>
+      <w:r>
+        <w:rPr>
+          <w:color w:val="000000" w:themeColor="text1"/>
+          <w:sz w:val="24"/>
+          <w:lang w:eastAsia="en-US"/>
+        </w:rPr>
+        <w:t xml:space="preserve"> object based on the provided arguments.</w:t>
+      </w:r>
+    </w:p>
+    <w:p>
+      <w:pPr>
+        <w:spacing w:line="360" w:lineRule="auto"/>
+        <w:jc w:val="both"/>
+        <w:rPr>
+          <w:b/>
+          <w:bCs/>
+          <w:sz w:val="28"/>
+          <w:szCs w:val="36"/>
+        </w:rPr>
+      </w:pPr>
+    </w:p>
+    <w:p>
+      <w:pPr>
+        <w:pStyle w:val="ListParagraph"/>
+        <w:numPr>
+          <w:ilvl w:val="0"/>
+          <w:numId w:val="7"/>
+        </w:numPr>
+        <w:spacing w:line="360" w:lineRule="auto"/>
+        <w:jc w:val="both"/>
+        <w:rPr>
+          <w:b/>
+          <w:bCs/>
+          <w:sz w:val="28"/>
+          <w:szCs w:val="36"/>
+        </w:rPr>
+      </w:pPr>
+      <w:r>
+        <w:rPr>
+          <w:b/>
+          <w:bCs/>
+          <w:sz w:val="28"/>
+          <w:szCs w:val="36"/>
+        </w:rPr>
+        <w:lastRenderedPageBreak/>
+        <w:drawing>
+          <wp:anchor distT="0" distB="0" distL="114300" distR="114300" simplePos="0" relativeHeight="251660288" behindDoc="0" locked="0" layoutInCell="1" allowOverlap="1" wp14:anchorId="4EFF59B8" wp14:editId="0BFFF5B7">
+            <wp:simplePos x="0" y="0"/>
+            <wp:positionH relativeFrom="column">
+              <wp:posOffset>3820363</wp:posOffset>
+            </wp:positionH>
+            <wp:positionV relativeFrom="paragraph">
+              <wp:posOffset>431665</wp:posOffset>
+            </wp:positionV>
+            <wp:extent cx="2928025" cy="1370330"/>
+            <wp:effectExtent l="0" t="0" r="5715" b="1270"/>
+            <wp:wrapSquare wrapText="bothSides"/>
+            <wp:docPr id="600651065" name="Picture 1" descr="A black screen with white text&#10;&#10;Description automatically generated"/>
+            <wp:cNvGraphicFramePr>
+              <a:graphicFrameLocks xmlns:a="http://schemas.openxmlformats.org/drawingml/2006/main" noChangeAspect="1"/>
+            </wp:cNvGraphicFramePr>
+            <a:graphic xmlns:a="http://schemas.openxmlformats.org/drawingml/2006/main">
+              <a:graphicData uri="http://schemas.openxmlformats.org/drawingml/2006/picture">
+                <pic:pic xmlns:pic="http://schemas.openxmlformats.org/drawingml/2006/picture">
+                  <pic:nvPicPr>
+                    <pic:cNvPr id="600651065" name="Picture 1" descr="A black screen with white text&#10;&#10;Description automatically generated"/>
+                    <pic:cNvPicPr/>
+                  </pic:nvPicPr>
+                  <pic:blipFill rotWithShape="1">
+                    <a:blip r:embed="rId11"/>
+                    <a:srcRect r="52127"/>
+                    <a:stretch/>
+                  </pic:blipFill>
+                  <pic:spPr bwMode="auto">
+                    <a:xfrm>
+                      <a:off x="0" y="0"/>
+                      <a:ext cx="2928025" cy="1370330"/>
+                    </a:xfrm>
+                    <a:prstGeom prst="rect">
+                      <a:avLst/>
+                    </a:prstGeom>
+                    <a:ln>
+                      <a:noFill/>
+                    </a:ln>
+                    <a:extLst>
+                      <a:ext uri="{53640926-AAD7-44D8-BBD7-CCE9431645EC}">
+                        <a14:shadowObscured xmlns:a14="http://schemas.microsoft.com/office/drawing/2010/main"/>
+                      </a:ext>
+                    </a:extLst>
+                  </pic:spPr>
+                </pic:pic>
+              </a:graphicData>
+            </a:graphic>
+          </wp:anchor>
+        </w:drawing>
+      </w:r>
+      <w:r>
+        <w:rPr>
+          <w:b/>
+          <w:bCs/>
+          <w:sz w:val="28"/>
+          <w:szCs w:val="36"/>
+        </w:rPr>
+        <w:t xml:space="preserve">Testing </w:t>
+      </w:r>
+      <w:r>
+        <w:rPr>
+          <w:b/>
+          <w:bCs/>
+          <w:sz w:val="28"/>
+          <w:szCs w:val="36"/>
+        </w:rPr>
+        <w:t>Locations:</w:t>
+      </w:r>
+    </w:p>
+    <w:p>
+      <w:pPr>
+        <w:pStyle w:val="ListParagraph"/>
+        <w:rPr>
+          <w:b/>
+          <w:bCs/>
+          <w:noProof/>
+          <w:sz w:val="28"/>
+          <w:szCs w:val="36"/>
+        </w:rPr>
+      </w:pPr>
+      <w:r>
+        <w:rPr>
+          <w:b/>
+          <w:bCs/>
+          <w:noProof/>
+          <w:sz w:val="28"/>
+          <w:szCs w:val="36"/>
+        </w:rPr>
+        <w:drawing>
+          <wp:anchor distT="0" distB="0" distL="114300" distR="114300" simplePos="0" relativeHeight="251659264" behindDoc="0" locked="0" layoutInCell="1" allowOverlap="1" wp14:anchorId="5CF3FF1E" wp14:editId="63010328">
+            <wp:simplePos x="0" y="0"/>
+            <wp:positionH relativeFrom="column">
+              <wp:posOffset>203835</wp:posOffset>
+            </wp:positionH>
+            <wp:positionV relativeFrom="paragraph">
+              <wp:posOffset>101600</wp:posOffset>
+            </wp:positionV>
+            <wp:extent cx="3569970" cy="8044180"/>
+            <wp:effectExtent l="0" t="0" r="0" b="0"/>
+            <wp:wrapSquare wrapText="bothSides"/>
+            <wp:docPr id="16885205" name="Picture 4"/>
+            <wp:cNvGraphicFramePr>
+              <a:graphicFrameLocks xmlns:a="http://schemas.openxmlformats.org/drawingml/2006/main" noChangeAspect="1"/>
+            </wp:cNvGraphicFramePr>
+            <a:graphic xmlns:a="http://schemas.openxmlformats.org/drawingml/2006/main">
+              <a:graphicData uri="http://schemas.openxmlformats.org/drawingml/2006/picture">
+                <pic:pic xmlns:pic="http://schemas.openxmlformats.org/drawingml/2006/picture">
+                  <pic:nvPicPr>
+                    <pic:cNvPr id="0" name="Picture 4"/>
+                    <pic:cNvPicPr>
+                      <a:picLocks noChangeAspect="1" noChangeArrowheads="1"/>
+                    </pic:cNvPicPr>
+                  </pic:nvPicPr>
+                  <pic:blipFill rotWithShape="1">
+                    <a:blip r:embed="rId12">
+                      <a:extLst>
+                        <a:ext uri="{28A0092B-C50C-407E-A947-70E740481C1C}">
+                          <a14:useLocalDpi xmlns:a14="http://schemas.microsoft.com/office/drawing/2010/main" val="0"/>
+                        </a:ext>
+                      </a:extLst>
+                    </a:blip>
+                    <a:srcRect l="5389" t="2635" r="5477" b="3278"/>
+                    <a:stretch/>
+                  </pic:blipFill>
+                  <pic:spPr bwMode="auto">
+                    <a:xfrm>
+                      <a:off x="0" y="0"/>
+                      <a:ext cx="3569970" cy="8044180"/>
+                    </a:xfrm>
+                    <a:prstGeom prst="rect">
+                      <a:avLst/>
+                    </a:prstGeom>
+                    <a:noFill/>
+                    <a:ln>
+                      <a:noFill/>
+                    </a:ln>
+                    <a:extLst>
+                      <a:ext uri="{53640926-AAD7-44D8-BBD7-CCE9431645EC}">
+                        <a14:shadowObscured xmlns:a14="http://schemas.microsoft.com/office/drawing/2010/main"/>
+                      </a:ext>
+                    </a:extLst>
+                  </pic:spPr>
+                </pic:pic>
+              </a:graphicData>
+            </a:graphic>
+            <wp14:sizeRelH relativeFrom="margin">
+              <wp14:pctWidth>0</wp14:pctWidth>
+            </wp14:sizeRelH>
+          </wp:anchor>
+        </w:drawing>
+      </w:r>
+    </w:p>
+    <w:p>
+      <w:pPr>
+        <w:pStyle w:val="ListParagraph"/>
+        <w:rPr>
+          <w:b/>
+          <w:bCs/>
+          <w:sz w:val="28"/>
+          <w:szCs w:val="36"/>
+        </w:rPr>
+      </w:pPr>
+    </w:p>
+    <w:p>
+      <w:pPr>
+        <w:pStyle w:val="ListParagraph"/>
+        <w:spacing w:line="360" w:lineRule="auto"/>
+        <w:jc w:val="both"/>
+        <w:rPr>
+          <w:b/>
+          <w:bCs/>
+          <w:sz w:val="28"/>
+          <w:szCs w:val="36"/>
+        </w:rPr>
+      </w:pPr>
+    </w:p>
+    <w:p>
+      <w:pPr>
+        <w:pStyle w:val="ListParagraph"/>
+        <w:spacing w:line="360" w:lineRule="auto"/>
+        <w:jc w:val="both"/>
+        <w:rPr>
+          <w:b/>
+          <w:bCs/>
+          <w:sz w:val="28"/>
+          <w:szCs w:val="36"/>
+        </w:rPr>
       </w:pPr>
     </w:p>
     <w:sectPr>
-      <w:headerReference w:type="default" r:id="rId9"/>
+      <w:headerReference w:type="default" r:id="rId13"/>
       <w:pgSz w:w="11900" w:h="16840"/>
       <w:pgMar w:top="1440" w:right="1134" w:bottom="1440" w:left="1134" w:header="709" w:footer="709" w:gutter="0"/>
       <w:cols w:space="708"/>
@@ -1362,6 +2297,209 @@
     </w:lvl>
   </w:abstractNum>
   <w:abstractNum w:abstractNumId="2" w15:restartNumberingAfterBreak="0">
+    <w:nsid w:val="21E62B0F"/>
+    <w:multiLevelType w:val="multilevel"/>
+    <w:tmpl w:val="570CEF52"/>
+    <w:lvl w:ilvl="0">
+      <w:start w:val="1"/>
+      <w:numFmt w:val="decimal"/>
+      <w:lvlText w:val="%1."/>
+      <w:lvlJc w:val="left"/>
+      <w:pPr>
+        <w:tabs>
+          <w:tab w:val="num" w:pos="720"/>
+        </w:tabs>
+        <w:ind w:left="720" w:hanging="360"/>
+      </w:pPr>
+    </w:lvl>
+    <w:lvl w:ilvl="1" w:tentative="1">
+      <w:start w:val="1"/>
+      <w:numFmt w:val="decimal"/>
+      <w:lvlText w:val="%2."/>
+      <w:lvlJc w:val="left"/>
+      <w:pPr>
+        <w:tabs>
+          <w:tab w:val="num" w:pos="1440"/>
+        </w:tabs>
+        <w:ind w:left="1440" w:hanging="360"/>
+      </w:pPr>
+    </w:lvl>
+    <w:lvl w:ilvl="2" w:tentative="1">
+      <w:start w:val="1"/>
+      <w:numFmt w:val="decimal"/>
+      <w:lvlText w:val="%3."/>
+      <w:lvlJc w:val="left"/>
+      <w:pPr>
+        <w:tabs>
+          <w:tab w:val="num" w:pos="2160"/>
+        </w:tabs>
+        <w:ind w:left="2160" w:hanging="360"/>
+      </w:pPr>
+    </w:lvl>
+    <w:lvl w:ilvl="3" w:tentative="1">
+      <w:start w:val="1"/>
+      <w:numFmt w:val="decimal"/>
+      <w:lvlText w:val="%4."/>
+      <w:lvlJc w:val="left"/>
+      <w:pPr>
+        <w:tabs>
+          <w:tab w:val="num" w:pos="2880"/>
+        </w:tabs>
+        <w:ind w:left="2880" w:hanging="360"/>
+      </w:pPr>
+    </w:lvl>
+    <w:lvl w:ilvl="4" w:tentative="1">
+      <w:start w:val="1"/>
+      <w:numFmt w:val="decimal"/>
+      <w:lvlText w:val="%5."/>
+      <w:lvlJc w:val="left"/>
+      <w:pPr>
+        <w:tabs>
+          <w:tab w:val="num" w:pos="3600"/>
+        </w:tabs>
+        <w:ind w:left="3600" w:hanging="360"/>
+      </w:pPr>
+    </w:lvl>
+    <w:lvl w:ilvl="5" w:tentative="1">
+      <w:start w:val="1"/>
+      <w:numFmt w:val="decimal"/>
+      <w:lvlText w:val="%6."/>
+      <w:lvlJc w:val="left"/>
+      <w:pPr>
+        <w:tabs>
+          <w:tab w:val="num" w:pos="4320"/>
+        </w:tabs>
+        <w:ind w:left="4320" w:hanging="360"/>
+      </w:pPr>
+    </w:lvl>
+    <w:lvl w:ilvl="6" w:tentative="1">
+      <w:start w:val="1"/>
+      <w:numFmt w:val="decimal"/>
+      <w:lvlText w:val="%7."/>
+      <w:lvlJc w:val="left"/>
+      <w:pPr>
+        <w:tabs>
+          <w:tab w:val="num" w:pos="5040"/>
+        </w:tabs>
+        <w:ind w:left="5040" w:hanging="360"/>
+      </w:pPr>
+    </w:lvl>
+    <w:lvl w:ilvl="7" w:tentative="1">
+      <w:start w:val="1"/>
+      <w:numFmt w:val="decimal"/>
+      <w:lvlText w:val="%8."/>
+      <w:lvlJc w:val="left"/>
+      <w:pPr>
+        <w:tabs>
+          <w:tab w:val="num" w:pos="5760"/>
+        </w:tabs>
+        <w:ind w:left="5760" w:hanging="360"/>
+      </w:pPr>
+    </w:lvl>
+    <w:lvl w:ilvl="8" w:tentative="1">
+      <w:start w:val="1"/>
+      <w:numFmt w:val="decimal"/>
+      <w:lvlText w:val="%9."/>
+      <w:lvlJc w:val="left"/>
+      <w:pPr>
+        <w:tabs>
+          <w:tab w:val="num" w:pos="6480"/>
+        </w:tabs>
+        <w:ind w:left="6480" w:hanging="360"/>
+      </w:pPr>
+    </w:lvl>
+  </w:abstractNum>
+  <w:abstractNum w:abstractNumId="3" w15:restartNumberingAfterBreak="0">
+    <w:nsid w:val="341B3124"/>
+    <w:multiLevelType w:val="hybridMultilevel"/>
+    <w:tmpl w:val="608EB272"/>
+    <w:lvl w:ilvl="0" w:tplc="44BC692E">
+      <w:start w:val="1"/>
+      <w:numFmt w:val="decimal"/>
+      <w:lvlText w:val="%1."/>
+      <w:lvlJc w:val="left"/>
+      <w:pPr>
+        <w:ind w:left="720" w:hanging="360"/>
+      </w:pPr>
+      <w:rPr>
+        <w:rFonts w:hint="default"/>
+        <w:b/>
+      </w:rPr>
+    </w:lvl>
+    <w:lvl w:ilvl="1" w:tplc="04090019" w:tentative="1">
+      <w:start w:val="1"/>
+      <w:numFmt w:val="lowerLetter"/>
+      <w:lvlText w:val="%2."/>
+      <w:lvlJc w:val="left"/>
+      <w:pPr>
+        <w:ind w:left="1440" w:hanging="360"/>
+      </w:pPr>
+    </w:lvl>
+    <w:lvl w:ilvl="2" w:tplc="0409001B" w:tentative="1">
+      <w:start w:val="1"/>
+      <w:numFmt w:val="lowerRoman"/>
+      <w:lvlText w:val="%3."/>
+      <w:lvlJc w:val="right"/>
+      <w:pPr>
+        <w:ind w:left="2160" w:hanging="180"/>
+      </w:pPr>
+    </w:lvl>
+    <w:lvl w:ilvl="3" w:tplc="0409000F" w:tentative="1">
+      <w:start w:val="1"/>
+      <w:numFmt w:val="decimal"/>
+      <w:lvlText w:val="%4."/>
+      <w:lvlJc w:val="left"/>
+      <w:pPr>
+        <w:ind w:left="2880" w:hanging="360"/>
+      </w:pPr>
+    </w:lvl>
+    <w:lvl w:ilvl="4" w:tplc="04090019" w:tentative="1">
+      <w:start w:val="1"/>
+      <w:numFmt w:val="lowerLetter"/>
+      <w:lvlText w:val="%5."/>
+      <w:lvlJc w:val="left"/>
+      <w:pPr>
+        <w:ind w:left="3600" w:hanging="360"/>
+      </w:pPr>
+    </w:lvl>
+    <w:lvl w:ilvl="5" w:tplc="0409001B" w:tentative="1">
+      <w:start w:val="1"/>
+      <w:numFmt w:val="lowerRoman"/>
+      <w:lvlText w:val="%6."/>
+      <w:lvlJc w:val="right"/>
+      <w:pPr>
+        <w:ind w:left="4320" w:hanging="180"/>
+      </w:pPr>
+    </w:lvl>
+    <w:lvl w:ilvl="6" w:tplc="0409000F" w:tentative="1">
+      <w:start w:val="1"/>
+      <w:numFmt w:val="decimal"/>
+      <w:lvlText w:val="%7."/>
+      <w:lvlJc w:val="left"/>
+      <w:pPr>
+        <w:ind w:left="5040" w:hanging="360"/>
+      </w:pPr>
+    </w:lvl>
+    <w:lvl w:ilvl="7" w:tplc="04090019" w:tentative="1">
+      <w:start w:val="1"/>
+      <w:numFmt w:val="lowerLetter"/>
+      <w:lvlText w:val="%8."/>
+      <w:lvlJc w:val="left"/>
+      <w:pPr>
+        <w:ind w:left="5760" w:hanging="360"/>
+      </w:pPr>
+    </w:lvl>
+    <w:lvl w:ilvl="8" w:tplc="0409001B" w:tentative="1">
+      <w:start w:val="1"/>
+      <w:numFmt w:val="lowerRoman"/>
+      <w:lvlText w:val="%9."/>
+      <w:lvlJc w:val="right"/>
+      <w:pPr>
+        <w:ind w:left="6480" w:hanging="180"/>
+      </w:pPr>
+    </w:lvl>
+  </w:abstractNum>
+  <w:abstractNum w:abstractNumId="4" w15:restartNumberingAfterBreak="0">
     <w:nsid w:val="3BFA2C2D"/>
     <w:multiLevelType w:val="hybridMultilevel"/>
     <w:tmpl w:val="F8A0C330"/>
@@ -1474,7 +2612,7 @@
       </w:rPr>
     </w:lvl>
   </w:abstractNum>
-  <w:abstractNum w:abstractNumId="3" w15:restartNumberingAfterBreak="0">
+  <w:abstractNum w:abstractNumId="5" w15:restartNumberingAfterBreak="0">
     <w:nsid w:val="4DB153A2"/>
     <w:multiLevelType w:val="multilevel"/>
     <w:tmpl w:val="865AB6C4"/>
@@ -1587,7 +2725,7 @@
       </w:pPr>
     </w:lvl>
   </w:abstractNum>
-  <w:abstractNum w:abstractNumId="4" w15:restartNumberingAfterBreak="0">
+  <w:abstractNum w:abstractNumId="6" w15:restartNumberingAfterBreak="0">
     <w:nsid w:val="5A1B13A5"/>
     <w:multiLevelType w:val="multilevel"/>
     <w:tmpl w:val="905EE156"/>
@@ -1736,7 +2874,7 @@
       </w:rPr>
     </w:lvl>
   </w:abstractNum>
-  <w:abstractNum w:abstractNumId="5" w15:restartNumberingAfterBreak="0">
+  <w:abstractNum w:abstractNumId="7" w15:restartNumberingAfterBreak="0">
     <w:nsid w:val="7ACB05C1"/>
     <w:multiLevelType w:val="hybridMultilevel"/>
     <w:tmpl w:val="616E4C48"/>
@@ -1849,14 +2987,130 @@
       </w:rPr>
     </w:lvl>
   </w:abstractNum>
+  <w:abstractNum w:abstractNumId="8" w15:restartNumberingAfterBreak="0">
+    <w:nsid w:val="7D26715C"/>
+    <w:multiLevelType w:val="hybridMultilevel"/>
+    <w:tmpl w:val="8D5CA3AA"/>
+    <w:lvl w:ilvl="0" w:tplc="881895BA">
+      <w:start w:val="1"/>
+      <w:numFmt w:val="bullet"/>
+      <w:lvlText w:val="-"/>
+      <w:lvlJc w:val="left"/>
+      <w:pPr>
+        <w:ind w:left="720" w:hanging="360"/>
+      </w:pPr>
+      <w:rPr>
+        <w:rFonts w:ascii="Arial" w:eastAsia="MS Mincho" w:hAnsi="Arial" w:cs="Arial" w:hint="default"/>
+        <w:b/>
+        <w:color w:val="767171" w:themeColor="background2" w:themeShade="80"/>
+        <w:sz w:val="28"/>
+      </w:rPr>
+    </w:lvl>
+    <w:lvl w:ilvl="1" w:tplc="04090003" w:tentative="1">
+      <w:start w:val="1"/>
+      <w:numFmt w:val="bullet"/>
+      <w:lvlText w:val="o"/>
+      <w:lvlJc w:val="left"/>
+      <w:pPr>
+        <w:ind w:left="1440" w:hanging="360"/>
+      </w:pPr>
+      <w:rPr>
+        <w:rFonts w:ascii="Courier New" w:hAnsi="Courier New" w:cs="Courier New" w:hint="default"/>
+      </w:rPr>
+    </w:lvl>
+    <w:lvl w:ilvl="2" w:tplc="04090005" w:tentative="1">
+      <w:start w:val="1"/>
+      <w:numFmt w:val="bullet"/>
+      <w:lvlText w:val=""/>
+      <w:lvlJc w:val="left"/>
+      <w:pPr>
+        <w:ind w:left="2160" w:hanging="360"/>
+      </w:pPr>
+      <w:rPr>
+        <w:rFonts w:ascii="Wingdings" w:hAnsi="Wingdings" w:hint="default"/>
+      </w:rPr>
+    </w:lvl>
+    <w:lvl w:ilvl="3" w:tplc="04090001" w:tentative="1">
+      <w:start w:val="1"/>
+      <w:numFmt w:val="bullet"/>
+      <w:lvlText w:val=""/>
+      <w:lvlJc w:val="left"/>
+      <w:pPr>
+        <w:ind w:left="2880" w:hanging="360"/>
+      </w:pPr>
+      <w:rPr>
+        <w:rFonts w:ascii="Symbol" w:hAnsi="Symbol" w:hint="default"/>
+      </w:rPr>
+    </w:lvl>
+    <w:lvl w:ilvl="4" w:tplc="04090003" w:tentative="1">
+      <w:start w:val="1"/>
+      <w:numFmt w:val="bullet"/>
+      <w:lvlText w:val="o"/>
+      <w:lvlJc w:val="left"/>
+      <w:pPr>
+        <w:ind w:left="3600" w:hanging="360"/>
+      </w:pPr>
+      <w:rPr>
+        <w:rFonts w:ascii="Courier New" w:hAnsi="Courier New" w:cs="Courier New" w:hint="default"/>
+      </w:rPr>
+    </w:lvl>
+    <w:lvl w:ilvl="5" w:tplc="04090005" w:tentative="1">
+      <w:start w:val="1"/>
+      <w:numFmt w:val="bullet"/>
+      <w:lvlText w:val=""/>
+      <w:lvlJc w:val="left"/>
+      <w:pPr>
+        <w:ind w:left="4320" w:hanging="360"/>
+      </w:pPr>
+      <w:rPr>
+        <w:rFonts w:ascii="Wingdings" w:hAnsi="Wingdings" w:hint="default"/>
+      </w:rPr>
+    </w:lvl>
+    <w:lvl w:ilvl="6" w:tplc="04090001" w:tentative="1">
+      <w:start w:val="1"/>
+      <w:numFmt w:val="bullet"/>
+      <w:lvlText w:val=""/>
+      <w:lvlJc w:val="left"/>
+      <w:pPr>
+        <w:ind w:left="5040" w:hanging="360"/>
+      </w:pPr>
+      <w:rPr>
+        <w:rFonts w:ascii="Symbol" w:hAnsi="Symbol" w:hint="default"/>
+      </w:rPr>
+    </w:lvl>
+    <w:lvl w:ilvl="7" w:tplc="04090003" w:tentative="1">
+      <w:start w:val="1"/>
+      <w:numFmt w:val="bullet"/>
+      <w:lvlText w:val="o"/>
+      <w:lvlJc w:val="left"/>
+      <w:pPr>
+        <w:ind w:left="5760" w:hanging="360"/>
+      </w:pPr>
+      <w:rPr>
+        <w:rFonts w:ascii="Courier New" w:hAnsi="Courier New" w:cs="Courier New" w:hint="default"/>
+      </w:rPr>
+    </w:lvl>
+    <w:lvl w:ilvl="8" w:tplc="04090005" w:tentative="1">
+      <w:start w:val="1"/>
+      <w:numFmt w:val="bullet"/>
+      <w:lvlText w:val=""/>
+      <w:lvlJc w:val="left"/>
+      <w:pPr>
+        <w:ind w:left="6480" w:hanging="360"/>
+      </w:pPr>
+      <w:rPr>
+        <w:rFonts w:ascii="Wingdings" w:hAnsi="Wingdings" w:hint="default"/>
+      </w:rPr>
+    </w:lvl>
+  </w:abstractNum>
   <w:num w:numId="1" w16cid:durableId="1156150151">
-    <w:abstractNumId w:val="5"/>
+    <w:abstractNumId w:val="7"/>
   </w:num>
   <w:num w:numId="2" w16cid:durableId="1359355386">
-    <w:abstractNumId w:val="2"/>
+    <w:abstractNumId w:val="4"/>
   </w:num>
   <w:num w:numId="3" w16cid:durableId="762144661">
-    <w:abstractNumId w:val="4"/>
+    <w:abstractNumId w:val="6"/>
   </w:num>
   <w:num w:numId="4" w16cid:durableId="1767075481">
     <w:abstractNumId w:val="0"/>
@@ -1865,6 +3119,15 @@
     <w:abstractNumId w:val="1"/>
   </w:num>
   <w:num w:numId="6" w16cid:durableId="341711697">
+    <w:abstractNumId w:val="5"/>
+  </w:num>
+  <w:num w:numId="7" w16cid:durableId="2110926952">
+    <w:abstractNumId w:val="8"/>
+  </w:num>
+  <w:num w:numId="8" w16cid:durableId="1532108689">
+    <w:abstractNumId w:val="2"/>
+  </w:num>
+  <w:num w:numId="9" w16cid:durableId="955672189">
     <w:abstractNumId w:val="3"/>
   </w:num>
 </w:numbering>
@@ -2434,6 +3697,46 @@
       <w:szCs w:val="18"/>
     </w:rPr>
   </w:style>
+  <w:style w:type="paragraph" w:styleId="ListParagraph">
+    <w:name w:val="List Paragraph"/>
+    <w:basedOn w:val="Normal"/>
+    <w:uiPriority w:val="72"/>
+    <w:qFormat/>
+    <w:rsid w:val="00E5739A"/>
+    <w:pPr>
+      <w:ind w:left="720"/>
+      <w:contextualSpacing/>
+    </w:pPr>
+  </w:style>
+  <w:style w:type="paragraph" w:styleId="NormalWeb">
+    <w:name w:val="Normal (Web)"/>
+    <w:basedOn w:val="Normal"/>
+    <w:uiPriority w:val="99"/>
+    <w:semiHidden/>
+    <w:unhideWhenUsed/>
+    <w:rsid w:val="00A06277"/>
+    <w:pPr>
+      <w:spacing w:before="100" w:beforeAutospacing="1" w:after="100" w:afterAutospacing="1"/>
+    </w:pPr>
+    <w:rPr>
+      <w:rFonts w:ascii="Times New Roman" w:eastAsia="Times New Roman" w:hAnsi="Times New Roman"/>
+      <w:sz w:val="24"/>
+      <w:lang w:val="en-US" w:eastAsia="en-US"/>
+    </w:rPr>
+  </w:style>
+  <w:style w:type="character" w:styleId="HTMLCode">
+    <w:name w:val="HTML Code"/>
+    <w:basedOn w:val="DefaultParagraphFont"/>
+    <w:uiPriority w:val="99"/>
+    <w:semiHidden/>
+    <w:unhideWhenUsed/>
+    <w:rsid w:val="00A06277"/>
+    <w:rPr>
+      <w:rFonts w:ascii="Courier New" w:eastAsia="Times New Roman" w:hAnsi="Courier New" w:cs="Courier New"/>
+      <w:sz w:val="20"/>
+      <w:szCs w:val="20"/>
+    </w:rPr>
+  </w:style>
 </w:styles>
 </file>
 

</xml_diff>